<commit_message>
Coördinatorscherm gebruiksvriendelijker: besluit wissen, categorieën in gewone taal, herinnering mailen, uitleg back-up
- Zichtbare knop 'Besluit wissen' bij Bespreken en Voorstellen (nogmaals klikken werkt ook nog).
- Categorie-keuzelijst bij Voorstellen in gewone taal en volle breedte; positie op een eigen regel.
  Ook elders in het coördinatorscherm de categorie in gewone taal (code in de tooltip).
- Paneltegels: wie het verst achterloopt krijgt een rode rand; knop 'Herinnering mailen'
  opent een kant-en-klare mail (mailto) in het eigen mailprogramma.
- Back-up: uitleg in de tooltip, een melding na het downloaden en een blok in Export.
- Kleine grijze tekst donkerder (voldoende contrast).
- Tests (5 nieuwe controles), README, VOORTGANG en coördinatorhandleiding bijgewerkt.

Co-Authored-By: Claude Opus 5.5 <noreply@anthropic.com>
Claude-Session: https://claude.ai/code/session_01Jx3jgACt2JiVRfqwELHUjU
</commit_message>
<xml_diff>
--- a/handleidingen/Handleiding_coordinator_levertekorten.docx
+++ b/handleidingen/Handleiding_coordinator_levertekorten.docx
@@ -1094,7 +1094,7 @@
         <w:t xml:space="preserve">Bovenste tegels</w:t>
       </w:r>
       <w:r>
-        <w:t xml:space="preserve">: de lijst die nu wordt beoordeeld, en per beoordelaar de voortgang ("110 van 299 beoordeeld"), het aantal eigen voorstellen en wanneer diegene het laatst iets deed. Zo zie je wie je een herinnering kunt sturen.</w:t>
+        <w:t xml:space="preserve">: de lijst die nu wordt beoordeeld, en per beoordelaar de voortgang ("110 van 299 beoordeeld"), het aantal eigen voorstellen en wanneer diegene het laatst iets deed. Wie het verst achterloopt, krijgt een rode rand en de tekst “Loopt het verst achter”. Met ✉ Herinnering mailen opent een kant-en-klare mail in je eigen mailprogramma, met de voortgang en de link naar de app. Die mail verstuur je zelf; de app verstuurt niets.</w:t>
       </w:r>
     </w:p>
     <w:p>
@@ -1362,7 +1362,7 @@
         <w:spacing w:after="60"/>
       </w:pPr>
       <w:r>
-        <w:t xml:space="preserve">Vergist? Klik nogmaals op het gekozen besluit om het te wissen.</w:t>
+        <w:t xml:space="preserve">Vergist? Klik onder de knoppen op ✕ Besluit wissen. De regel staat dan weer open; een notitie blijft staan.</w:t>
       </w:r>
     </w:p>
     <w:p>
@@ -2216,7 +2216,7 @@
         <w:t xml:space="preserve">Back-up</w:t>
       </w:r>
       <w:r>
-        <w:t xml:space="preserve"> (rechtsboven): een JSON-bestand met alle oordelen, besluiten en de coördinatiegegevens. Handig als extra zekerheid.</w:t>
+        <w:t xml:space="preserve"> (rechtsboven): een JSON-bestand met alle oordelen, besluiten en de coördinatiegegevens. Niet verplicht, want alles staat al in de database: het is een extra kopie voor de zekerheid. Supabase maakt op het gratis plan zelf geen back-ups die je kunt downloaden. Maak er daarom een na elk paneloverleg en vóór elke publicatie. De knop staat ook onderaan het tabblad Export.</w:t>
       </w:r>
     </w:p>
     <w:p>

</xml_diff>

<commit_message>
Laadbestand: alleen nieuwe regels, want OA voegt toe aan de bestaande tabel
- Laadbestand bevat niet meer de gepubliceerde lijst, alleen de nieuwe akkoord-regels
  (wat OA al heeft, wordt overgeslagen); waarschuwing als de gepubliceerde lijst niet geladen is
- Nieuw: Volledige lijst (gepubliceerd + nieuw) voor de volgende ronde, niet voor OA
- Nieuw: lijstje te verwijderen regels voor gepubliceerde adviezen die het panel nu afwijst
- Logboek: tabbladen Laadbestand en Volledige lijst; 'In laadbestand' = ja / al gepubliceerd / nee
- Browsertest met een gepubliceerde lijst (6 controles), handleiding coördinator hoofdstuk 7
  (Word + HTML, afbeeldingen 7-9), README, VOORTGANG en CLAUDE.md bijgewerkt

Co-Authored-By: Claude Opus 5.5 <noreply@anthropic.com>
Claude-Session: https://claude.ai/code/session_01ChVedcKSyHjhqt5ksW6Q7S
</commit_message>
<xml_diff>
--- a/handleidingen/Handleiding_coordinator_levertekorten.docx
+++ b/handleidingen/Handleiding_coordinator_levertekorten.docx
@@ -364,7 +364,7 @@
               <w:t xml:space="preserve">Export</w:t>
             </w:r>
             <w:r>
-              <w:t xml:space="preserve">: laad de laatst gepubliceerde lijst, maak het laadbestand en het logboek.</w:t>
+              <w:t xml:space="preserve">: laad de gepubliceerde lijst, maak het laadbestand (alleen de nieuwe regels, voor OA), de volledige lijst (voor de volgende ronde) en het logboek.</w:t>
             </w:r>
           </w:p>
         </w:tc>
@@ -1111,7 +1111,7 @@
           <w:b/>
           <w:bCs/>
         </w:rPr>
-        <w:t xml:space="preserve">Gepubliceerde lijst (optioneel)</w:t>
+        <w:t xml:space="preserve">Gepubliceerde lijst</w:t>
       </w:r>
       <w:r>
         <w:t xml:space="preserve">: hier laad je de laatst gepubliceerde OA-lijst (zie hoofdstuk 7).</w:t>
@@ -1720,7 +1720,7 @@
       <w:r>
         <w:drawing>
           <wp:inline distT="0" distB="0" distL="0" distR="0">
-            <wp:extent cx="6096000" cy="5057775"/>
+            <wp:extent cx="6096000" cy="6800850"/>
             <wp:effectExtent t="0" r="0" b="0" l="0"/>
             <wp:docPr id="1" name="c07_export.png" descr="Coördineren → Export." title="Coördineren → Export."/>
             <wp:cNvGraphicFramePr>
@@ -1745,7 +1745,7 @@
                   <pic:spPr bwMode="auto">
                     <a:xfrm>
                       <a:off x="0" y="0"/>
-                      <a:ext cx="6096000" cy="5057775"/>
+                      <a:ext cx="6096000" cy="6800850"/>
                     </a:xfrm>
                     <a:prstGeom prst="rect">
                       <a:avLst/>
@@ -1779,12 +1779,32 @@
         <w:pStyle w:val="Heading2"/>
       </w:pPr>
       <w:r>
-        <w:t xml:space="preserve">Stap 1: laad de laatst gepubliceerde lijst</w:t>
-      </w:r>
-    </w:p>
-    <w:p>
-      <w:r>
-        <w:t xml:space="preserve">Klik in de tegel </w:t>
+        <w:t xml:space="preserve">Stap 1: laad de gepubliceerde lijst (de huidige tabel in OA)</w:t>
+      </w:r>
+    </w:p>
+    <w:p>
+      <w:r>
+        <w:t xml:space="preserve">OA </w:t>
+      </w:r>
+      <w:r>
+        <w:rPr>
+          <w:b/>
+          <w:bCs/>
+        </w:rPr>
+        <w:t xml:space="preserve">voegt</w:t>
+      </w:r>
+      <w:r>
+        <w:t xml:space="preserve"> een laadbestand </w:t>
+      </w:r>
+      <w:r>
+        <w:rPr>
+          <w:b/>
+          <w:bCs/>
+        </w:rPr>
+        <w:t xml:space="preserve">toe</w:t>
+      </w:r>
+      <w:r>
+        <w:t xml:space="preserve"> aan de bestaande tabel. Laad daarom eerst de laatst gepubliceerde lijst: klik in de tegel </w:t>
       </w:r>
       <w:r>
         <w:rPr>
@@ -1804,7 +1824,7 @@
         <w:t xml:space="preserve">Lijst laden…</w:t>
       </w:r>
       <w:r>
-        <w:t xml:space="preserve"> en kies het laatst gepubliceerde laadbestand, bijvoorbeeld </w:t>
+        <w:t xml:space="preserve"> en kies het bestand, bijvoorbeeld </w:t>
       </w:r>
       <w:r>
         <w:rPr>
@@ -1815,7 +1835,7 @@
         <w:t xml:space="preserve">alternatieve-prk-regels-20260916.csv</w:t>
       </w:r>
       <w:r>
-        <w:t xml:space="preserve">. Het nieuwe laadbestand bevat dan die lijst plus de nieuwe regels, zonder dubbelingen. Laad je niets, dan bevat het bestand alleen de nieuwe regels.</w:t>
+        <w:t xml:space="preserve">. De app ziet dan welke regels OA al heeft en zet die niet nog eens in het laadbestand. Laad je niets, dan kunnen regels dubbel in OA komen; de app waarschuwt daarvoor.</w:t>
       </w:r>
     </w:p>
     <w:p>
@@ -1827,7 +1847,7 @@
       <w:r>
         <w:drawing>
           <wp:inline distT="0" distB="0" distL="0" distR="0">
-            <wp:extent cx="2133600" cy="1266825"/>
+            <wp:extent cx="2133600" cy="1390703"/>
             <wp:effectExtent t="0" r="0" b="0" l="0"/>
             <wp:docPr id="1" name="c09_gepubliceerde_lijst.png" descr="De tegel om de gepubliceerde lijst te laden." title="De tegel om de gepubliceerde lijst te laden."/>
             <wp:cNvGraphicFramePr>
@@ -1852,7 +1872,7 @@
                   <pic:spPr bwMode="auto">
                     <a:xfrm>
                       <a:off x="0" y="0"/>
-                      <a:ext cx="2133600" cy="1266825"/>
+                      <a:ext cx="2133600" cy="1390703"/>
                     </a:xfrm>
                     <a:prstGeom prst="rect">
                       <a:avLst/>
@@ -1891,17 +1911,7 @@
         <w:spacing w:after="60"/>
       </w:pPr>
       <w:r>
-        <w:t xml:space="preserve">Gepubliceerde adviezen die het panel nu afwijst, </w:t>
-      </w:r>
-      <w:r>
-        <w:rPr>
-          <w:b/>
-          <w:bCs/>
-        </w:rPr>
-        <w:t xml:space="preserve">blijven standaard staan</w:t>
-      </w:r>
-      <w:r>
-        <w:t xml:space="preserve">. Op het tabblad Export kun je met een vinkje kiezen om ze eruit te halen.</w:t>
+        <w:t xml:space="preserve">De geladen lijst wordt bewaard in de database; je hoeft hem maar één keer te laden.</w:t>
       </w:r>
     </w:p>
     <w:p>
@@ -1914,7 +1924,27 @@
         <w:spacing w:after="60"/>
       </w:pPr>
       <w:r>
-        <w:t xml:space="preserve">De geladen lijst wordt bewaard in de database; je hoeft hem maar één keer te laden.</w:t>
+        <w:t xml:space="preserve">Gepubliceerde adviezen die het panel nu </w:t>
+      </w:r>
+      <w:r>
+        <w:rPr>
+          <w:b/>
+          <w:bCs/>
+        </w:rPr>
+        <w:t xml:space="preserve">afwijst</w:t>
+      </w:r>
+      <w:r>
+        <w:t xml:space="preserve">, kan een laadbestand niet weghalen. De app zet ze apart op het tabblad Export. Met </w:t>
+      </w:r>
+      <w:r>
+        <w:rPr>
+          <w:b/>
+          <w:bCs/>
+        </w:rPr>
+        <w:t xml:space="preserve">Lijst te verwijderen regels downloaden</w:t>
+      </w:r>
+      <w:r>
+        <w:t xml:space="preserve"> krijg je ze in hetzelfde formaat, om OA te vragen ze te verwijderen. Doe je dat, zet dan het vinkje aan; ze gaan dan ook uit de volledige lijst (stap 3).</w:t>
       </w:r>
     </w:p>
     <w:p>
@@ -1947,7 +1977,7 @@
         <w:t xml:space="preserve">Laadbestand maken…</w:t>
       </w:r>
       <w:r>
-        <w:t xml:space="preserve">. Je ziet eerst een samenvatting met het aantal regels en een voorbeeld. Klik op </w:t>
+        <w:t xml:space="preserve">. Je ziet eerst een samenvatting: hoeveel akkoord-regels er zijn, hoeveel daarvan OA al heeft (die worden overgeslagen) en hoeveel regels er in het bestand komen, met een voorbeeld. Klik op </w:t>
       </w:r>
       <w:r>
         <w:rPr>
@@ -1957,7 +1987,14 @@
         <w:t xml:space="preserve">Opslaan</w:t>
       </w:r>
       <w:r>
-        <w:t xml:space="preserve"> om het bestand te downloaden.</w:t>
+        <w:t xml:space="preserve"> om het bestand te downloaden. </w:t>
+      </w:r>
+      <w:r>
+        <w:rPr>
+          <w:b/>
+          <w:bCs/>
+        </w:rPr>
+        <w:t xml:space="preserve">Dit bestand stuur je naar OA.</w:t>
       </w:r>
     </w:p>
     <w:p>
@@ -2168,7 +2205,17 @@
         <w:spacing w:after="60"/>
       </w:pPr>
       <w:r>
-        <w:t xml:space="preserve">alleen eindstatus Akkoord (inclusief besluiten na overleg en aangenomen voorstellen), per tekort in cascadevolgorde.</w:t>
+        <w:t xml:space="preserve">alleen </w:t>
+      </w:r>
+      <w:r>
+        <w:rPr>
+          <w:b/>
+          <w:bCs/>
+        </w:rPr>
+        <w:t xml:space="preserve">nieuwe</w:t>
+      </w:r>
+      <w:r>
+        <w:t xml:space="preserve"> regels: eindstatus Akkoord (inclusief besluiten na overleg en aangenomen voorstellen) en nog niet in de gepubliceerde lijst; per tekort in cascadevolgorde.</w:t>
       </w:r>
     </w:p>
     <w:p>
@@ -2176,6 +2223,50 @@
         <w:pStyle w:val="Heading2"/>
       </w:pPr>
       <w:r>
+        <w:t xml:space="preserve">Stap 3: bewaar de volledige lijst voor de volgende ronde</w:t>
+      </w:r>
+    </w:p>
+    <w:p>
+      <w:r>
+        <w:t xml:space="preserve">Klik op </w:t>
+      </w:r>
+      <w:r>
+        <w:rPr>
+          <w:b/>
+          <w:bCs/>
+        </w:rPr>
+        <w:t xml:space="preserve">Volledige lijst maken…</w:t>
+      </w:r>
+      <w:r>
+        <w:t xml:space="preserve"> (alleen zichtbaar als er een gepubliceerde lijst is geladen). Dat bestand, </w:t>
+      </w:r>
+      <w:r>
+        <w:rPr>
+          <w:rFonts w:ascii="Consolas" w:cs="Consolas" w:eastAsia="Consolas" w:hAnsi="Consolas"/>
+          <w:sz w:val="19"/>
+          <w:szCs w:val="19"/>
+        </w:rPr>
+        <w:t xml:space="preserve">alternatieve-prk-regels-volledig-&lt;jjjjmmdd&gt;.csv</w:t>
+      </w:r>
+      <w:r>
+        <w:t xml:space="preserve">, bevat de gepubliceerde lijst plus de nieuwe regels: zo ziet de tabel in OA eruit nadat het laadbestand is toegevoegd. </w:t>
+      </w:r>
+      <w:r>
+        <w:rPr>
+          <w:b/>
+          <w:bCs/>
+        </w:rPr>
+        <w:t xml:space="preserve">Stuur het niet naar OA.</w:t>
+      </w:r>
+      <w:r>
+        <w:t xml:space="preserve"> Bewaar het en laad het in de volgende ronde bij stap 1 als gepubliceerde lijst.</w:t>
+      </w:r>
+    </w:p>
+    <w:p>
+      <w:pPr>
+        <w:pStyle w:val="Heading2"/>
+      </w:pPr>
+      <w:r>
         <w:t xml:space="preserve">Logboek en back-up</w:t>
       </w:r>
     </w:p>
@@ -2196,7 +2287,7 @@
         <w:t xml:space="preserve">Logboek exporteren</w:t>
       </w:r>
       <w:r>
-        <w:t xml:space="preserve"> (tabblad Export): een Excel-bestand met per regel alle oordelen en toelichtingen, de uitkomst, het besluit na overleg en of de regel in het laadbestand staat, plus de voorstellen. Bewaar dit bij elke publicatie.</w:t>
+        <w:t xml:space="preserve"> (tabblad Export): een Excel-bestand met per regel alle oordelen en toelichtingen, de uitkomst, het besluit na overleg en of de regel in het laadbestand staat (ja, al gepubliceerd of nee), plus de voorstellen. Op aparte tabbladen staan het laadbestand en de volledige lijst. Bewaar dit bij elke publicatie.</w:t>
       </w:r>
     </w:p>
     <w:p>
@@ -3716,7 +3807,7 @@
         <w:spacing w:after="60"/>
       </w:pPr>
       <w:r>
-        <w:t xml:space="preserve">Laatst gepubliceerde lijst geladen; laadbestand gemaakt en gecontroleerd in de samenvatting.</w:t>
+        <w:t xml:space="preserve">Laatst gepubliceerde lijst geladen; laadbestand gemaakt, gecontroleerd in de samenvatting en naar OA gestuurd; volledige lijst bewaard voor de volgende ronde.</w:t>
       </w:r>
     </w:p>
     <w:p>

</xml_diff>

<commit_message>
OA kan geen regels verwijderen: lijstje te verwijderen regels en vinkje weer weg
- Afgewezen gepubliceerde adviezen blijven in OA en in de volledige lijst; de app meldt ze alleen
- Samenvatting laadbestand waarschuwt: OA kan regels daarna niet meer verwijderen, controleer goed
- Handleiding coördinator (Word + HTML, afbeeldingen 7 en 9), README, VOORTGANG, CLAUDE.md en test bijgewerkt

Co-Authored-By: Claude Opus 5.5 <noreply@anthropic.com>
Claude-Session: https://claude.ai/code/session_01ChVedcKSyHjhqt5ksW6Q7S
</commit_message>
<xml_diff>
--- a/handleidingen/Handleiding_coordinator_levertekorten.docx
+++ b/handleidingen/Handleiding_coordinator_levertekorten.docx
@@ -1720,7 +1720,7 @@
       <w:r>
         <w:drawing>
           <wp:inline distT="0" distB="0" distL="0" distR="0">
-            <wp:extent cx="6096000" cy="6800850"/>
+            <wp:extent cx="6096000" cy="6550025"/>
             <wp:effectExtent t="0" r="0" b="0" l="0"/>
             <wp:docPr id="1" name="c07_export.png" descr="Coördineren → Export." title="Coördineren → Export."/>
             <wp:cNvGraphicFramePr>
@@ -1745,7 +1745,7 @@
                   <pic:spPr bwMode="auto">
                     <a:xfrm>
                       <a:off x="0" y="0"/>
-                      <a:ext cx="6096000" cy="6800850"/>
+                      <a:ext cx="6096000" cy="6550025"/>
                     </a:xfrm>
                     <a:prstGeom prst="rect">
                       <a:avLst/>
@@ -1934,17 +1934,7 @@
         <w:t xml:space="preserve">afwijst</w:t>
       </w:r>
       <w:r>
-        <w:t xml:space="preserve">, kan een laadbestand niet weghalen. De app zet ze apart op het tabblad Export. Met </w:t>
-      </w:r>
-      <w:r>
-        <w:rPr>
-          <w:b/>
-          <w:bCs/>
-        </w:rPr>
-        <w:t xml:space="preserve">Lijst te verwijderen regels downloaden</w:t>
-      </w:r>
-      <w:r>
-        <w:t xml:space="preserve"> krijg je ze in hetzelfde formaat, om OA te vragen ze te verwijderen. Doe je dat, zet dan het vinkje aan; ze gaan dan ook uit de volledige lijst (stap 3).</w:t>
+        <w:t xml:space="preserve">, blijven in OA staan: OA kan geen regels verwijderen en een laadbestand voegt alleen toe. De app toont ze apart op het tabblad Export. Ze staan ook in de volledige lijst (stap 3).</w:t>
       </w:r>
     </w:p>
     <w:p>
@@ -1995,6 +1985,9 @@
           <w:bCs/>
         </w:rPr>
         <w:t xml:space="preserve">Dit bestand stuur je naar OA.</w:t>
+      </w:r>
+      <w:r>
+        <w:t xml:space="preserve"> OA kan regels daarna niet meer verwijderen; controleer het bestand dus goed voordat je het verstuurt.</w:t>
       </w:r>
     </w:p>
     <w:p>

</xml_diff>

<commit_message>
Coördinator: tabblad Opzoeken (staat een product in de lijst of al in OA?)
- kern: opzoeken() zoekt op naam, merknaam, PRK of ZI (via de Z-index) in de huidige lijst
  (tekort, tekort zonder alternatief, alternatief) en in de gepubliceerde lijst (advies / alternatief in OA)
- Coördinatorscherm: tabblad Opzoeken met per product de stand van het panel, voorstellen en wat er al in OA staat
- Tests (kern + browser), handleiding coördinator (Word + HTML), README en VOORTGANG bijgewerkt

Co-Authored-By: Claude Opus 5.5 <noreply@anthropic.com>
Claude-Session: https://claude.ai/code/session_01ChVedcKSyHjhqt5ksW6Q7S
</commit_message>
<xml_diff>
--- a/handleidingen/Handleiding_coordinator_levertekorten.docx
+++ b/handleidingen/Handleiding_coordinator_levertekorten.docx
@@ -1723,6 +1723,98 @@
           <w:szCs w:val="18"/>
         </w:rPr>
         <w:t xml:space="preserve">Afbeelding 6. Coördineren → Alle regels.</w:t>
+      </w:r>
+    </w:p>
+    <w:p>
+      <w:pPr>
+        <w:pStyle w:val="Heading2"/>
+      </w:pPr>
+      <w:r>
+        <w:t xml:space="preserve">Opzoeken: staat een product in de lijst of al in OA?</w:t>
+      </w:r>
+    </w:p>
+    <w:p>
+      <w:r>
+        <w:t xml:space="preserve">Krijg je de vraag of een product al in de advieslijst zit of nog beoordeeld wordt, gebruik dan het tabblad </w:t>
+      </w:r>
+      <w:r>
+        <w:rPr>
+          <w:b/>
+          <w:bCs/>
+        </w:rPr>
+        <w:t xml:space="preserve">Opzoeken</w:t>
+      </w:r>
+      <w:r>
+        <w:t xml:space="preserve">. Zoek op naam, merknaam, PRK of ZI-nummer (bijvoorbeeld "tramadol druppels", "xarelto" of "14761718"). Per product zie je:</w:t>
+      </w:r>
+    </w:p>
+    <w:p>
+      <w:pPr>
+        <w:pStyle w:val="ListParagraph"/>
+        <w:numPr>
+          <w:ilvl w:val="0"/>
+          <w:numId w:val="2"/>
+        </w:numPr>
+        <w:spacing w:after="60"/>
+      </w:pPr>
+      <w:r>
+        <w:t xml:space="preserve">of het een </w:t>
+      </w:r>
+      <w:r>
+        <w:rPr>
+          <w:b/>
+          <w:bCs/>
+        </w:rPr>
+        <w:t xml:space="preserve">tekort in de huidige lijst</w:t>
+      </w:r>
+      <w:r>
+        <w:t xml:space="preserve"> is, met prio, voorraad en per alternatief de stand van het panel (Akkoord, Bespreken, Onvolledig enzovoort);</w:t>
+      </w:r>
+    </w:p>
+    <w:p>
+      <w:pPr>
+        <w:pStyle w:val="ListParagraph"/>
+        <w:numPr>
+          <w:ilvl w:val="0"/>
+          <w:numId w:val="2"/>
+        </w:numPr>
+        <w:spacing w:after="60"/>
+      </w:pPr>
+      <w:r>
+        <w:t xml:space="preserve">of het in de huidige lijst als </w:t>
+      </w:r>
+      <w:r>
+        <w:rPr>
+          <w:b/>
+          <w:bCs/>
+        </w:rPr>
+        <w:t xml:space="preserve">alternatief</w:t>
+      </w:r>
+      <w:r>
+        <w:t xml:space="preserve"> bij een ander tekort staat, en eventuele voorstellen van het panel;</w:t>
+      </w:r>
+    </w:p>
+    <w:p>
+      <w:pPr>
+        <w:pStyle w:val="ListParagraph"/>
+        <w:numPr>
+          <w:ilvl w:val="0"/>
+          <w:numId w:val="2"/>
+        </w:numPr>
+        <w:spacing w:after="60"/>
+      </w:pPr>
+      <w:r>
+        <w:t xml:space="preserve">of er </w:t>
+      </w:r>
+      <w:r>
+        <w:rPr>
+          <w:b/>
+          <w:bCs/>
+        </w:rPr>
+        <w:t xml:space="preserve">al een advies in OA</w:t>
+      </w:r>
+      <w:r>
+        <w:t xml:space="preserve"> staat voor dit product, en of het in OA als alternatief bij een ander product staat. Dat laatste kan alleen als de gepubliceerde lijst is geladen (tegel bovenaan).</w:t>
       </w:r>
     </w:p>
     <w:p>

</xml_diff>